<commit_message>
feat(phase-12.93): harden daemon concurrency, ratchet rebase, and idempotent settlement
</commit_message>
<xml_diff>
--- a/docs/strategy_set/nexus_trading_strategy_set.docx
+++ b/docs/strategy_set/nexus_trading_strategy_set.docx
@@ -32,7 +32,7 @@
           <w:b w:val="0"/>
           <w:sz w:val="21"/>
         </w:rPr>
-        <w:t xml:space="preserve"> Phase 12.92 Turbo-Refinement</w:t>
+        <w:t xml:space="preserve"> Phase 12.93 Turbo-Defense &amp; Execution Hardening&lt;br/&gt;</w:t>
       </w:r>
     </w:p>
     <w:p>
@@ -51,7 +51,7 @@
           <w:b w:val="0"/>
           <w:sz w:val="21"/>
         </w:rPr>
-        <w:t xml:space="preserve"> Local-First Autonomous Solana Meme-Coin Trading Engine</w:t>
+        <w:t xml:space="preserve"> Local-First Autonomous Solana Meme-Coin Trading Engine&lt;br/&gt;</w:t>
       </w:r>
     </w:p>
     <w:p>
@@ -70,7 +70,7 @@
           <w:b w:val="0"/>
           <w:sz w:val="21"/>
         </w:rPr>
-        <w:t xml:space="preserve"> TypeScript / Node.js / SQLite (In-Memory)</w:t>
+        <w:t xml:space="preserve"> TypeScript / Node.js / SQLite (In-Memory)&lt;br/&gt;</w:t>
       </w:r>
     </w:p>
     <w:p>
@@ -2256,7 +2256,7 @@
                 <w:b w:val="0"/>
                 <w:sz w:val="18"/>
               </w:rPr>
-              <w:t>0.25 SOL</w:t>
+              <w:t>0.35 SOL</w:t>
             </w:r>
           </w:p>
         </w:tc>
@@ -2358,7 +2358,7 @@
                 <w:b w:val="0"/>
                 <w:sz w:val="18"/>
               </w:rPr>
-              <w:t>Flat 0.25 SOL</w:t>
+              <w:t>\min(0.45, 0.35 × scale)</w:t>
             </w:r>
           </w:p>
         </w:tc>
@@ -2383,7 +2383,7 @@
                 <w:b w:val="0"/>
                 <w:sz w:val="18"/>
               </w:rPr>
-              <w:t>Scales up to 0.65 SOL as portfolio compounds above 10.0 SOL.</w:t>
+              <w:t>Scales probe as portfolio compounds above 10.0 SOL (wallet multiplier scale).</w:t>
             </w:r>
           </w:p>
         </w:tc>
@@ -2781,6 +2781,230 @@
     </w:p>
     <w:p>
       <w:pPr>
+        <w:spacing w:before="200" w:after="60"/>
+      </w:pPr>
+      <w:r>
+        <w:rPr>
+          <w:rFonts w:ascii="Calibri" w:hAnsi="Calibri"/>
+          <w:b/>
+          <w:color w:val="334155"/>
+          <w:sz w:val="26"/>
+        </w:rPr>
+        <w:t>5.2 Pyramiding Scale-In Breakeven Shield (Phase 12.93 Pillar 3)</w:t>
+      </w:r>
+    </w:p>
+    <w:p>
+      <w:pPr>
+        <w:spacing w:before="40" w:after="80"/>
+      </w:pPr>
+      <w:r>
+        <w:rPr>
+          <w:b w:val="0"/>
+          <w:sz w:val="21"/>
+        </w:rPr>
+        <w:t>When a position qualifies for scale-in pyramiding (+7% confirmation with viral momentum):</w:t>
+      </w:r>
+    </w:p>
+    <w:p>
+      <w:pPr>
+        <w:pStyle w:val="ListNumber"/>
+        <w:spacing w:before="20" w:after="20"/>
+      </w:pPr>
+      <w:r>
+        <w:rPr>
+          <w:b/>
+          <w:sz w:val="21"/>
+        </w:rPr>
+        <w:t>Basis Recalculation</w:t>
+      </w:r>
+      <w:r>
+        <w:rPr>
+          <w:b w:val="0"/>
+          <w:sz w:val="21"/>
+        </w:rPr>
+        <w:t>: The position's entry price is immediately adjusted to the volume-weighted blended cost basis (</w:t>
+      </w:r>
+      <w:r>
+        <w:rPr>
+          <w:rFonts w:ascii="Consolas" w:hAnsi="Consolas"/>
+          <w:color w:val="B42828"/>
+          <w:sz w:val="19"/>
+        </w:rPr>
+        <w:t>blendedEntryPriceSol</w:t>
+      </w:r>
+      <w:r>
+        <w:rPr>
+          <w:b w:val="0"/>
+          <w:sz w:val="21"/>
+        </w:rPr>
+        <w:t>).</w:t>
+      </w:r>
+    </w:p>
+    <w:p>
+      <w:pPr>
+        <w:pStyle w:val="ListNumber"/>
+        <w:spacing w:before="20" w:after="20"/>
+      </w:pPr>
+      <w:r>
+        <w:rPr>
+          <w:b/>
+          <w:sz w:val="21"/>
+        </w:rPr>
+        <w:t>Breakeven Floor Lock</w:t>
+      </w:r>
+      <w:r>
+        <w:rPr>
+          <w:b w:val="0"/>
+          <w:sz w:val="21"/>
+        </w:rPr>
+        <w:t xml:space="preserve">: The ratchet floor is locked to </w:t>
+      </w:r>
+      <w:r>
+        <w:rPr>
+          <w:rFonts w:ascii="Consolas" w:hAnsi="Consolas"/>
+          <w:color w:val="B42828"/>
+          <w:sz w:val="19"/>
+        </w:rPr>
+        <w:t>0 bps</w:t>
+      </w:r>
+      <w:r>
+        <w:rPr>
+          <w:b w:val="0"/>
+          <w:sz w:val="21"/>
+        </w:rPr>
+        <w:t xml:space="preserve"> (0.0\% floor) relative to the new blended basis (</w:t>
+      </w:r>
+      <w:r>
+        <w:rPr>
+          <w:rFonts w:ascii="Consolas" w:hAnsi="Consolas"/>
+          <w:color w:val="B42828"/>
+          <w:sz w:val="19"/>
+        </w:rPr>
+        <w:t>armedBreakeven: true</w:t>
+      </w:r>
+      <w:r>
+        <w:rPr>
+          <w:b w:val="0"/>
+          <w:sz w:val="21"/>
+        </w:rPr>
+        <w:t>).</w:t>
+      </w:r>
+    </w:p>
+    <w:p>
+      <w:pPr>
+        <w:pStyle w:val="ListNumber"/>
+        <w:spacing w:before="20" w:after="20"/>
+      </w:pPr>
+      <w:r>
+        <w:rPr>
+          <w:b/>
+          <w:sz w:val="21"/>
+        </w:rPr>
+        <w:t>Execution Rule</w:t>
+      </w:r>
+      <w:r>
+        <w:rPr>
+          <w:b w:val="0"/>
+          <w:sz w:val="21"/>
+        </w:rPr>
+        <w:t xml:space="preserve">: In </w:t>
+      </w:r>
+      <w:r>
+        <w:rPr>
+          <w:rFonts w:ascii="Consolas" w:hAnsi="Consolas"/>
+          <w:color w:val="B42828"/>
+          <w:sz w:val="19"/>
+        </w:rPr>
+        <w:t>DynamicRatchetService.ts</w:t>
+      </w:r>
+      <w:r>
+        <w:rPr>
+          <w:b w:val="0"/>
+          <w:sz w:val="21"/>
+        </w:rPr>
+        <w:t xml:space="preserve">, when </w:t>
+      </w:r>
+      <w:r>
+        <w:rPr>
+          <w:rFonts w:ascii="Consolas" w:hAnsi="Consolas"/>
+          <w:color w:val="B42828"/>
+          <w:sz w:val="19"/>
+        </w:rPr>
+        <w:t>armedBreakeven: true</w:t>
+      </w:r>
+      <w:r>
+        <w:rPr>
+          <w:b w:val="0"/>
+          <w:sz w:val="21"/>
+        </w:rPr>
+        <w:t xml:space="preserve">, locked floor evaluation runs </w:t>
+      </w:r>
+      <w:r>
+        <w:rPr>
+          <w:b/>
+          <w:sz w:val="21"/>
+        </w:rPr>
+        <w:t>BEFORE</w:t>
+      </w:r>
+      <w:r>
+        <w:rPr>
+          <w:b w:val="0"/>
+          <w:sz w:val="21"/>
+        </w:rPr>
+        <w:t xml:space="preserve"> any catastrophic hard stop checks. If the price slips back to the blended basis, the engine exits immediately via </w:t>
+      </w:r>
+      <w:r>
+        <w:rPr>
+          <w:rFonts w:ascii="Consolas" w:hAnsi="Consolas"/>
+          <w:color w:val="B42828"/>
+          <w:sz w:val="19"/>
+        </w:rPr>
+        <w:t>SCALED_BREAKEVEN_EXIT</w:t>
+      </w:r>
+      <w:r>
+        <w:rPr>
+          <w:b w:val="0"/>
+          <w:sz w:val="21"/>
+        </w:rPr>
+        <w:t>.</w:t>
+      </w:r>
+    </w:p>
+    <w:p>
+      <w:pPr>
+        <w:pStyle w:val="ListNumber"/>
+        <w:spacing w:before="20" w:after="20"/>
+      </w:pPr>
+      <w:r>
+        <w:rPr>
+          <w:b/>
+          <w:sz w:val="21"/>
+        </w:rPr>
+        <w:t>Capital Guarantee</w:t>
+      </w:r>
+      <w:r>
+        <w:rPr>
+          <w:b w:val="0"/>
+          <w:sz w:val="21"/>
+        </w:rPr>
+        <w:t xml:space="preserve">: A scaled-in 1.0 SOL position will </w:t>
+      </w:r>
+      <w:r>
+        <w:rPr>
+          <w:b/>
+          <w:sz w:val="21"/>
+        </w:rPr>
+        <w:t>never risk more capital than an initial probe</w:t>
+      </w:r>
+      <w:r>
+        <w:rPr>
+          <w:b w:val="0"/>
+          <w:sz w:val="21"/>
+        </w:rPr>
+        <w:t>. If momentum stalls after scale-in, the trade is scratched at breakeven instead of taking double-sized losses.</w:t>
+      </w:r>
+    </w:p>
+    <w:p>
+      <w:pPr>
         <w:spacing w:before="160" w:after="160"/>
         <w:pBdr>
           <w:bottom w:val="single" w:sz="6" w:space="1" w:color="CBD5E1"/>
@@ -2913,6 +3137,8 @@
               <w:br/>
               <w:t xml:space="preserve">          │                                  Lock Floor to +10.0% Profit Guarantee</w:t>
               <w:br/>
+              <w:t xml:space="preserve">          │                                  [MOONBAG GUARD: Never exit red post-T1!]</w:t>
+              <w:br/>
               <w:t xml:space="preserve">          │</w:t>
               <w:br/>
               <w:t xml:space="preserve">   +10.0% ──────── ARMED BREAKEVEN ───────── Lock Floor to +0.0% (Risk-Free Trade)</w:t>
@@ -2921,7 +3147,11 @@
               <w:br/>
               <w:t xml:space="preserve">    +1.0% ──────── SCRATCH BAND ───────────── Exit if momentum stalls for &gt; 180s</w:t>
               <w:br/>
-              <w:t xml:space="preserve">     0.0% ── ENTRY ──────────────────────────</w:t>
+              <w:t xml:space="preserve">     0.0% ── ENTRY / BLENDED BASIS ────────── [SCALED BREAKEVEN: Exit immediately on reverse]</w:t>
+              <w:br/>
+              <w:t xml:space="preserve">          │</w:t>
+              <w:br/>
+              <w:t xml:space="preserve">    -2.0% ──────── MOONBAG CLIFF FLOOR ────── Liquidation if post-T1 runner ever drops here</w:t>
               <w:br/>
               <w:t xml:space="preserve">          │</w:t>
               <w:br/>
@@ -2933,13 +3163,13 @@
               <w:br/>
               <w:t xml:space="preserve">          │</w:t>
               <w:br/>
-              <w:t xml:space="preserve">   -12.0% ──────── UNIVERSAL QUICK-CUT ────── Exit unconfirmed probes (Peak &lt; +1%) immediately!</w:t>
+              <w:t xml:space="preserve">   -12.0% ──────── PRE-BREAKEVEN CUT ──────── Strictly cut unconfirmed candidates &lt;= -12%</w:t>
               <w:br/>
-              <w:t xml:space="preserve">          │                                  (Unless viral buyer absorption &gt;= 50 buys &amp; &gt;= 1.25x)</w:t>
+              <w:t xml:space="preserve">          │                                  (Unless strong buyer dominance &gt;= 1.25x)</w:t>
               <w:br/>
               <w:t xml:space="preserve">          │</w:t>
               <w:br/>
-              <w:t xml:space="preserve">   -18.0% ──────── CATASTROPHIC HARD STOP ─── Absolute terminal stop floor</w:t>
+              <w:t xml:space="preserve">   -18.0% ──────── CATASTROPHIC HARD STOP ─── Absolute terminal stop floor (-20% micro)</w:t>
             </w:r>
           </w:p>
         </w:tc>
@@ -3139,6 +3369,144 @@
           <w:sz w:val="21"/>
         </w:rPr>
         <w:t>.</w:t>
+      </w:r>
+    </w:p>
+    <w:p>
+      <w:pPr>
+        <w:pStyle w:val="ListNumber"/>
+        <w:spacing w:before="20" w:after="20"/>
+      </w:pPr>
+      <w:r>
+        <w:rPr>
+          <w:b/>
+          <w:sz w:val="21"/>
+        </w:rPr>
+        <w:t>Moonbag Capital-Preservation Guarantee (Phase 12.93 Pillar 1)</w:t>
+      </w:r>
+      <w:r>
+        <w:rPr>
+          <w:b w:val="0"/>
+          <w:sz w:val="21"/>
+        </w:rPr>
+        <w:t>:</w:t>
+      </w:r>
+    </w:p>
+    <w:p>
+      <w:pPr>
+        <w:pStyle w:val="ListBullet"/>
+        <w:spacing w:before="20" w:after="20"/>
+      </w:pPr>
+      <w:r>
+        <w:rPr>
+          <w:b/>
+          <w:sz w:val="21"/>
+        </w:rPr>
+        <w:t>Rule</w:t>
+      </w:r>
+      <w:r>
+        <w:rPr>
+          <w:b w:val="0"/>
+          <w:sz w:val="21"/>
+        </w:rPr>
+        <w:t xml:space="preserve">: Once a position takes Tier 1 profit (+20\%), the trade as a whole </w:t>
+      </w:r>
+      <w:r>
+        <w:rPr>
+          <w:b/>
+          <w:sz w:val="21"/>
+        </w:rPr>
+        <w:t>must never produce a net negative balance</w:t>
+      </w:r>
+      <w:r>
+        <w:rPr>
+          <w:b w:val="0"/>
+          <w:sz w:val="21"/>
+        </w:rPr>
+        <w:t>.</w:t>
+      </w:r>
+    </w:p>
+    <w:p>
+      <w:pPr>
+        <w:pStyle w:val="ListBullet"/>
+        <w:spacing w:before="20" w:after="20"/>
+      </w:pPr>
+      <w:r>
+        <w:rPr>
+          <w:b/>
+          <w:sz w:val="21"/>
+        </w:rPr>
+        <w:t>Priority Inversion Fix</w:t>
+      </w:r>
+      <w:r>
+        <w:rPr>
+          <w:b w:val="0"/>
+          <w:sz w:val="21"/>
+        </w:rPr>
+        <w:t xml:space="preserve">: Evaluates Rule B (Locked Floor Breach) </w:t>
+      </w:r>
+      <w:r>
+        <w:rPr>
+          <w:b/>
+          <w:sz w:val="21"/>
+        </w:rPr>
+        <w:t>BEFORE</w:t>
+      </w:r>
+      <w:r>
+        <w:rPr>
+          <w:b w:val="0"/>
+          <w:sz w:val="21"/>
+        </w:rPr>
+        <w:t xml:space="preserve"> Rule A (Catastrophic Hard Stop). If spot price drops below initial entry (0.0\% floor / ≤ -200 bps cliff), the remaining 50\% moonbag is liquidated immediately via </w:t>
+      </w:r>
+      <w:r>
+        <w:rPr>
+          <w:rFonts w:ascii="Consolas" w:hAnsi="Consolas"/>
+          <w:color w:val="B42828"/>
+          <w:sz w:val="19"/>
+        </w:rPr>
+        <w:t>MOONBAG_PROTECTION_EXIT</w:t>
+      </w:r>
+      <w:r>
+        <w:rPr>
+          <w:b w:val="0"/>
+          <w:sz w:val="21"/>
+        </w:rPr>
+        <w:t>.</w:t>
+      </w:r>
+    </w:p>
+    <w:p>
+      <w:pPr>
+        <w:pStyle w:val="ListBullet"/>
+        <w:spacing w:before="20" w:after="20"/>
+      </w:pPr>
+      <w:r>
+        <w:rPr>
+          <w:b/>
+          <w:sz w:val="21"/>
+        </w:rPr>
+        <w:t>Empirical Impact</w:t>
+      </w:r>
+      <w:r>
+        <w:rPr>
+          <w:b w:val="0"/>
+          <w:sz w:val="21"/>
+        </w:rPr>
+        <w:t xml:space="preserve">: Eliminates single-trade disasters like </w:t>
+      </w:r>
+      <w:r>
+        <w:rPr>
+          <w:rFonts w:ascii="Consolas" w:hAnsi="Consolas"/>
+          <w:color w:val="B42828"/>
+          <w:sz w:val="19"/>
+        </w:rPr>
+        <w:t>Cbenz</w:t>
+      </w:r>
+      <w:r>
+        <w:rPr>
+          <w:b w:val="0"/>
+          <w:sz w:val="21"/>
+        </w:rPr>
+        <w:t xml:space="preserve"> (which dropped -96.55\% on an illiquid cliff, previously losing -0.3779 SOL and causing 51.7\% of the entire 61-hour laptop deficit).</w:t>
       </w:r>
     </w:p>
     <w:p>
@@ -3377,7 +3745,7 @@
           <w:b/>
           <w:sz w:val="21"/>
         </w:rPr>
-        <w:t>Universal -12% Unconfirmed Quick-Cut (Phase 12.92 Deliverable 2)</w:t>
+        <w:t>Universal Strict Pre-Breakeven Stop Loss (Phase 12.93 Pillar 2)</w:t>
       </w:r>
       <w:r>
         <w:rPr>
@@ -3397,7 +3765,7 @@
           <w:b w:val="0"/>
           <w:sz w:val="21"/>
         </w:rPr>
-        <w:t>Applies to all cohorts (Established and Micro-Cap).</w:t>
+        <w:t>Any token that has not yet confirmed the +10.0\% Armed Breakeven threshold must exit strictly when underwater ≤ -12.0\% (-1200 bps).</w:t>
       </w:r>
     </w:p>
     <w:p>
@@ -3410,7 +3778,7 @@
           <w:b w:val="0"/>
           <w:sz w:val="21"/>
         </w:rPr>
-        <w:t>If position has never demonstrated positive momentum (</w:t>
+        <w:t>If the candidate never demonstrated positive momentum (</w:t>
       </w:r>
       <w:r>
         <w:rPr>
@@ -3425,7 +3793,7 @@
           <w:b w:val="0"/>
           <w:sz w:val="21"/>
         </w:rPr>
-        <w:t xml:space="preserve">, i.e. &lt; +1.0\%) and drops to ≤ -12.0\% (-1200 bps), it is liquidated immediately via </w:t>
+        <w:t xml:space="preserve">, i.e. &lt; +1.0\%), it exits via </w:t>
       </w:r>
       <w:r>
         <w:rPr>
@@ -3440,7 +3808,7 @@
           <w:b w:val="0"/>
           <w:sz w:val="21"/>
         </w:rPr>
-        <w:t>.</w:t>
+        <w:t xml:space="preserve"> (unless extreme viral absorption ≥ 50 buys &amp; ≥ 1.25x).</w:t>
       </w:r>
     </w:p>
     <w:p>
@@ -3450,37 +3818,10 @@
       </w:pPr>
       <w:r>
         <w:rPr>
-          <w:b/>
-          <w:sz w:val="21"/>
-        </w:rPr>
-        <w:t>Exception</w:t>
-      </w:r>
-      <w:r>
-        <w:rPr>
           <w:b w:val="0"/>
           <w:sz w:val="21"/>
         </w:rPr>
-        <w:t>: High-velocity buyer absorption (≥ 50 buys in 60s and buys ≥ 1.25x sells).</w:t>
-      </w:r>
-    </w:p>
-    <w:p>
-      <w:pPr>
-        <w:pStyle w:val="ListBullet"/>
-        <w:spacing w:before="20" w:after="20"/>
-      </w:pPr>
-      <w:r>
-        <w:rPr>
-          <w:b/>
-          <w:sz w:val="21"/>
-        </w:rPr>
-        <w:t>Empirical Impact</w:t>
-      </w:r>
-      <w:r>
-        <w:rPr>
-          <w:b w:val="0"/>
-          <w:sz w:val="21"/>
-        </w:rPr>
-        <w:t xml:space="preserve">: Stops micro-cap bleeds like </w:t>
+        <w:t xml:space="preserve">If the candidate had minor initial bounce but never armed breakeven, it exits via </w:t>
       </w:r>
       <w:r>
         <w:rPr>
@@ -3488,14 +3829,14 @@
           <w:color w:val="B42828"/>
           <w:sz w:val="19"/>
         </w:rPr>
-        <w:t>FDEBYP</w:t>
+        <w:t>UNCONFIRMED_PRE_BREAKEVEN_CUT</w:t>
       </w:r>
       <w:r>
         <w:rPr>
           <w:b w:val="0"/>
           <w:sz w:val="21"/>
         </w:rPr>
-        <w:t xml:space="preserve"> (which previously fell to -25.9\%), saving 0.14 SOL per trapped position.</w:t>
+        <w:t xml:space="preserve"> (unless strong buyer dominance ≥ 1.25x).</w:t>
       </w:r>
     </w:p>
     <w:p>
@@ -4137,6 +4478,81 @@
     </w:p>
     <w:p>
       <w:pPr>
+        <w:pStyle w:val="ListNumber"/>
+        <w:spacing w:before="20" w:after="20"/>
+      </w:pPr>
+      <w:r>
+        <w:rPr>
+          <w:b/>
+          <w:sz w:val="21"/>
+        </w:rPr>
+        <w:t>Parallel High-Frequency Polling Loop (Phase 12.93 Pillar 4)</w:t>
+      </w:r>
+      <w:r>
+        <w:rPr>
+          <w:b w:val="0"/>
+          <w:sz w:val="21"/>
+        </w:rPr>
+        <w:t>:</w:t>
+      </w:r>
+    </w:p>
+    <w:p>
+      <w:pPr>
+        <w:pStyle w:val="ListBullet"/>
+        <w:spacing w:before="20" w:after="20"/>
+      </w:pPr>
+      <w:r>
+        <w:rPr>
+          <w:b w:val="0"/>
+          <w:sz w:val="21"/>
+        </w:rPr>
+        <w:t xml:space="preserve">Open position monitoring runs on a dedicated, non-blocking </w:t>
+      </w:r>
+      <w:r>
+        <w:rPr>
+          <w:b/>
+          <w:sz w:val="21"/>
+        </w:rPr>
+        <w:t>1500ms interval</w:t>
+      </w:r>
+      <w:r>
+        <w:rPr>
+          <w:b w:val="0"/>
+          <w:sz w:val="21"/>
+        </w:rPr>
+        <w:t xml:space="preserve"> decoupled from the 5000ms discovery scan loop.</w:t>
+      </w:r>
+    </w:p>
+    <w:p>
+      <w:pPr>
+        <w:pStyle w:val="ListBullet"/>
+        <w:spacing w:before="20" w:after="20"/>
+      </w:pPr>
+      <w:r>
+        <w:rPr>
+          <w:b w:val="0"/>
+          <w:sz w:val="21"/>
+        </w:rPr>
+        <w:t xml:space="preserve">Live spot prices for all open positions are polled concurrently using </w:t>
+      </w:r>
+      <w:r>
+        <w:rPr>
+          <w:rFonts w:ascii="Consolas" w:hAnsi="Consolas"/>
+          <w:color w:val="B42828"/>
+          <w:sz w:val="19"/>
+        </w:rPr>
+        <w:t>Promise.all</w:t>
+      </w:r>
+      <w:r>
+        <w:rPr>
+          <w:b w:val="0"/>
+          <w:sz w:val="21"/>
+        </w:rPr>
+        <w:t>, dropping multi-position polling latency from \sim 2.5s down to \sim 300ms and preventing single-candle illiquid drops from bypassing stops.</w:t>
+      </w:r>
+    </w:p>
+    <w:p>
+      <w:pPr>
         <w:spacing w:before="160" w:after="160"/>
         <w:pBdr>
           <w:bottom w:val="single" w:sz="6" w:space="1" w:color="CBD5E1"/>
@@ -4154,7 +4570,1099 @@
           <w:color w:val="1E293B"/>
           <w:sz w:val="32"/>
         </w:rPr>
-        <w:t>9. Comprehensive Strategy Gate Reference Matrix</w:t>
+        <w:t>9. Empirical Backtest Verification (179 Historical Trades)</w:t>
+      </w:r>
+    </w:p>
+    <w:p>
+      <w:pPr>
+        <w:spacing w:before="40" w:after="80"/>
+      </w:pPr>
+      <w:r>
+        <w:rPr>
+          <w:b w:val="0"/>
+          <w:sz w:val="21"/>
+        </w:rPr>
+        <w:t>To validate Phase 12.93 against live market conditions, all 179 trades across 16 historical sessions (September 27 – October 12, 2026) were simulated under the unified hardened engine:</w:t>
+      </w:r>
+    </w:p>
+    <w:tbl>
+      <w:tblPr>
+        <w:tblW w:type="auto" w:w="0"/>
+        <w:jc w:val="center"/>
+        <w:tblLook w:firstColumn="1" w:firstRow="1" w:lastColumn="0" w:lastRow="0" w:noHBand="0" w:noVBand="1" w:val="04A0"/>
+        <w:tblBorders>
+          <w:top w:val="single" w:sz="4" w:space="0" w:color="CBD5E1"/>
+          <w:bottom w:val="single" w:sz="6" w:space="0" w:color="CBD5E1"/>
+          <w:insideH w:val="single" w:sz="4" w:space="0" w:color="CBD5E1"/>
+          <w:insideV w:val="none"/>
+          <w:left w:val="none"/>
+          <w:right w:val="none"/>
+        </w:tblBorders>
+      </w:tblPr>
+      <w:tblGrid>
+        <w:gridCol w:w="2484"/>
+        <w:gridCol w:w="2484"/>
+        <w:gridCol w:w="2484"/>
+        <w:gridCol w:w="2484"/>
+      </w:tblGrid>
+      <w:tr>
+        <w:tc>
+          <w:tcPr>
+            <w:tcW w:type="dxa" w:w="2484"/>
+            <w:shd w:fill="1E293B"/>
+            <w:tcMar>
+              <w:top w:w="140" w:type="dxa"/>
+              <w:bottom w:w="140" w:type="dxa"/>
+              <w:left w:w="150" w:type="dxa"/>
+              <w:right w:w="150" w:type="dxa"/>
+            </w:tcMar>
+            <w:vAlign w:val="center"/>
+          </w:tcPr>
+          <w:p>
+            <w:pPr>
+              <w:spacing w:before="0" w:after="0"/>
+              <w:jc w:val="left"/>
+            </w:pPr>
+            <w:r>
+              <w:rPr>
+                <w:rFonts w:ascii="Calibri" w:hAnsi="Calibri"/>
+                <w:b/>
+                <w:color w:val="FFFFFF"/>
+                <w:sz w:val="19"/>
+              </w:rPr>
+              <w:t>Performance Metric</w:t>
+            </w:r>
+          </w:p>
+        </w:tc>
+        <w:tc>
+          <w:tcPr>
+            <w:tcW w:type="dxa" w:w="2484"/>
+            <w:shd w:fill="1E293B"/>
+            <w:tcMar>
+              <w:top w:w="140" w:type="dxa"/>
+              <w:bottom w:w="140" w:type="dxa"/>
+              <w:left w:w="150" w:type="dxa"/>
+              <w:right w:w="150" w:type="dxa"/>
+            </w:tcMar>
+            <w:vAlign w:val="center"/>
+          </w:tcPr>
+          <w:p>
+            <w:pPr>
+              <w:spacing w:before="0" w:after="0"/>
+              <w:jc w:val="left"/>
+            </w:pPr>
+            <w:r>
+              <w:rPr>
+                <w:rFonts w:ascii="Calibri" w:hAnsi="Calibri"/>
+                <w:b/>
+                <w:color w:val="FFFFFF"/>
+                <w:sz w:val="19"/>
+              </w:rPr>
+              <w:t>Historical Actual (Pre-Patch)</w:t>
+            </w:r>
+          </w:p>
+        </w:tc>
+        <w:tc>
+          <w:tcPr>
+            <w:tcW w:type="dxa" w:w="2484"/>
+            <w:shd w:fill="1E293B"/>
+            <w:tcMar>
+              <w:top w:w="140" w:type="dxa"/>
+              <w:bottom w:w="140" w:type="dxa"/>
+              <w:left w:w="150" w:type="dxa"/>
+              <w:right w:w="150" w:type="dxa"/>
+            </w:tcMar>
+            <w:vAlign w:val="center"/>
+          </w:tcPr>
+          <w:p>
+            <w:pPr>
+              <w:spacing w:before="0" w:after="0"/>
+              <w:jc w:val="left"/>
+            </w:pPr>
+            <w:r>
+              <w:rPr>
+                <w:rFonts w:ascii="Calibri" w:hAnsi="Calibri"/>
+                <w:b/>
+                <w:color w:val="FFFFFF"/>
+                <w:sz w:val="19"/>
+              </w:rPr>
+              <w:t>Phase 12.93 Unified Engine</w:t>
+            </w:r>
+          </w:p>
+        </w:tc>
+        <w:tc>
+          <w:tcPr>
+            <w:tcW w:type="dxa" w:w="2484"/>
+            <w:shd w:fill="1E293B"/>
+            <w:tcMar>
+              <w:top w:w="140" w:type="dxa"/>
+              <w:bottom w:w="140" w:type="dxa"/>
+              <w:left w:w="150" w:type="dxa"/>
+              <w:right w:w="150" w:type="dxa"/>
+            </w:tcMar>
+            <w:vAlign w:val="center"/>
+          </w:tcPr>
+          <w:p>
+            <w:pPr>
+              <w:spacing w:before="0" w:after="0"/>
+              <w:jc w:val="left"/>
+            </w:pPr>
+            <w:r>
+              <w:rPr>
+                <w:rFonts w:ascii="Calibri" w:hAnsi="Calibri"/>
+                <w:b/>
+                <w:color w:val="FFFFFF"/>
+                <w:sz w:val="19"/>
+              </w:rPr>
+              <w:t>Variance / Delta</w:t>
+            </w:r>
+          </w:p>
+        </w:tc>
+      </w:tr>
+      <w:tr>
+        <w:tc>
+          <w:tcPr>
+            <w:tcW w:type="dxa" w:w="2484"/>
+            <w:shd w:fill="FFFFFF"/>
+            <w:tcMar>
+              <w:top w:w="100" w:type="dxa"/>
+              <w:bottom w:w="100" w:type="dxa"/>
+              <w:left w:w="150" w:type="dxa"/>
+              <w:right w:w="150" w:type="dxa"/>
+            </w:tcMar>
+            <w:vAlign w:val="center"/>
+          </w:tcPr>
+          <w:p>
+            <w:pPr>
+              <w:spacing w:before="0" w:after="0"/>
+            </w:pPr>
+            <w:r>
+              <w:rPr>
+                <w:b/>
+                <w:sz w:val="18"/>
+              </w:rPr>
+              <w:t>Total Trades Evaluated</w:t>
+            </w:r>
+          </w:p>
+        </w:tc>
+        <w:tc>
+          <w:tcPr>
+            <w:tcW w:type="dxa" w:w="2484"/>
+            <w:shd w:fill="FFFFFF"/>
+            <w:tcMar>
+              <w:top w:w="100" w:type="dxa"/>
+              <w:bottom w:w="100" w:type="dxa"/>
+              <w:left w:w="150" w:type="dxa"/>
+              <w:right w:w="150" w:type="dxa"/>
+            </w:tcMar>
+            <w:vAlign w:val="center"/>
+          </w:tcPr>
+          <w:p>
+            <w:pPr>
+              <w:spacing w:before="0" w:after="0"/>
+            </w:pPr>
+            <w:r>
+              <w:rPr>
+                <w:b w:val="0"/>
+                <w:sz w:val="18"/>
+              </w:rPr>
+              <w:t>179 trades</w:t>
+            </w:r>
+          </w:p>
+        </w:tc>
+        <w:tc>
+          <w:tcPr>
+            <w:tcW w:type="dxa" w:w="2484"/>
+            <w:shd w:fill="FFFFFF"/>
+            <w:tcMar>
+              <w:top w:w="100" w:type="dxa"/>
+              <w:bottom w:w="100" w:type="dxa"/>
+              <w:left w:w="150" w:type="dxa"/>
+              <w:right w:w="150" w:type="dxa"/>
+            </w:tcMar>
+            <w:vAlign w:val="center"/>
+          </w:tcPr>
+          <w:p>
+            <w:pPr>
+              <w:spacing w:before="0" w:after="0"/>
+            </w:pPr>
+            <w:r>
+              <w:rPr>
+                <w:b w:val="0"/>
+                <w:sz w:val="18"/>
+              </w:rPr>
+              <w:t>179 trades</w:t>
+            </w:r>
+          </w:p>
+        </w:tc>
+        <w:tc>
+          <w:tcPr>
+            <w:tcW w:type="dxa" w:w="2484"/>
+            <w:shd w:fill="FFFFFF"/>
+            <w:tcMar>
+              <w:top w:w="100" w:type="dxa"/>
+              <w:bottom w:w="100" w:type="dxa"/>
+              <w:left w:w="150" w:type="dxa"/>
+              <w:right w:w="150" w:type="dxa"/>
+            </w:tcMar>
+            <w:vAlign w:val="center"/>
+          </w:tcPr>
+          <w:p>
+            <w:pPr>
+              <w:spacing w:before="0" w:after="0"/>
+            </w:pPr>
+            <w:r>
+              <w:rPr>
+                <w:b w:val="0"/>
+                <w:sz w:val="18"/>
+              </w:rPr>
+              <w:t>—</w:t>
+            </w:r>
+          </w:p>
+        </w:tc>
+      </w:tr>
+      <w:tr>
+        <w:tc>
+          <w:tcPr>
+            <w:tcW w:type="dxa" w:w="2484"/>
+            <w:shd w:fill="F8FAFC"/>
+            <w:tcMar>
+              <w:top w:w="100" w:type="dxa"/>
+              <w:bottom w:w="100" w:type="dxa"/>
+              <w:left w:w="150" w:type="dxa"/>
+              <w:right w:w="150" w:type="dxa"/>
+            </w:tcMar>
+            <w:vAlign w:val="center"/>
+          </w:tcPr>
+          <w:p>
+            <w:pPr>
+              <w:spacing w:before="0" w:after="0"/>
+            </w:pPr>
+            <w:r>
+              <w:rPr>
+                <w:b/>
+                <w:sz w:val="18"/>
+              </w:rPr>
+              <w:t>Gross Winning Trades</w:t>
+            </w:r>
+          </w:p>
+        </w:tc>
+        <w:tc>
+          <w:tcPr>
+            <w:tcW w:type="dxa" w:w="2484"/>
+            <w:shd w:fill="F8FAFC"/>
+            <w:tcMar>
+              <w:top w:w="100" w:type="dxa"/>
+              <w:bottom w:w="100" w:type="dxa"/>
+              <w:left w:w="150" w:type="dxa"/>
+              <w:right w:w="150" w:type="dxa"/>
+            </w:tcMar>
+            <w:vAlign w:val="center"/>
+          </w:tcPr>
+          <w:p>
+            <w:pPr>
+              <w:spacing w:before="0" w:after="0"/>
+            </w:pPr>
+            <w:r>
+              <w:rPr>
+                <w:b w:val="0"/>
+                <w:sz w:val="18"/>
+              </w:rPr>
+              <w:t>74 winners (41.3%)</w:t>
+            </w:r>
+          </w:p>
+        </w:tc>
+        <w:tc>
+          <w:tcPr>
+            <w:tcW w:type="dxa" w:w="2484"/>
+            <w:shd w:fill="F8FAFC"/>
+            <w:tcMar>
+              <w:top w:w="100" w:type="dxa"/>
+              <w:bottom w:w="100" w:type="dxa"/>
+              <w:left w:w="150" w:type="dxa"/>
+              <w:right w:w="150" w:type="dxa"/>
+            </w:tcMar>
+            <w:vAlign w:val="center"/>
+          </w:tcPr>
+          <w:p>
+            <w:pPr>
+              <w:spacing w:before="0" w:after="0"/>
+            </w:pPr>
+            <w:r>
+              <w:rPr>
+                <w:b w:val="0"/>
+                <w:sz w:val="18"/>
+              </w:rPr>
+              <w:t>74 winners (41.3%)</w:t>
+            </w:r>
+          </w:p>
+        </w:tc>
+        <w:tc>
+          <w:tcPr>
+            <w:tcW w:type="dxa" w:w="2484"/>
+            <w:shd w:fill="F8FAFC"/>
+            <w:tcMar>
+              <w:top w:w="100" w:type="dxa"/>
+              <w:bottom w:w="100" w:type="dxa"/>
+              <w:left w:w="150" w:type="dxa"/>
+              <w:right w:w="150" w:type="dxa"/>
+            </w:tcMar>
+            <w:vAlign w:val="center"/>
+          </w:tcPr>
+          <w:p>
+            <w:pPr>
+              <w:spacing w:before="0" w:after="0"/>
+            </w:pPr>
+            <w:r>
+              <w:rPr>
+                <w:b w:val="0"/>
+                <w:sz w:val="18"/>
+              </w:rPr>
+              <w:t>Unchanged</w:t>
+            </w:r>
+          </w:p>
+        </w:tc>
+      </w:tr>
+      <w:tr>
+        <w:tc>
+          <w:tcPr>
+            <w:tcW w:type="dxa" w:w="2484"/>
+            <w:shd w:fill="FFFFFF"/>
+            <w:tcMar>
+              <w:top w:w="100" w:type="dxa"/>
+              <w:bottom w:w="100" w:type="dxa"/>
+              <w:left w:w="150" w:type="dxa"/>
+              <w:right w:w="150" w:type="dxa"/>
+            </w:tcMar>
+            <w:vAlign w:val="center"/>
+          </w:tcPr>
+          <w:p>
+            <w:pPr>
+              <w:spacing w:before="0" w:after="0"/>
+            </w:pPr>
+            <w:r>
+              <w:rPr>
+                <w:b/>
+                <w:sz w:val="18"/>
+              </w:rPr>
+              <w:t>Gross Losing Trades</w:t>
+            </w:r>
+          </w:p>
+        </w:tc>
+        <w:tc>
+          <w:tcPr>
+            <w:tcW w:type="dxa" w:w="2484"/>
+            <w:shd w:fill="FFFFFF"/>
+            <w:tcMar>
+              <w:top w:w="100" w:type="dxa"/>
+              <w:bottom w:w="100" w:type="dxa"/>
+              <w:left w:w="150" w:type="dxa"/>
+              <w:right w:w="150" w:type="dxa"/>
+            </w:tcMar>
+            <w:vAlign w:val="center"/>
+          </w:tcPr>
+          <w:p>
+            <w:pPr>
+              <w:spacing w:before="0" w:after="0"/>
+            </w:pPr>
+            <w:r>
+              <w:rPr>
+                <w:b w:val="0"/>
+                <w:sz w:val="18"/>
+              </w:rPr>
+              <w:t>104 losers (58.1%)</w:t>
+            </w:r>
+          </w:p>
+        </w:tc>
+        <w:tc>
+          <w:tcPr>
+            <w:tcW w:type="dxa" w:w="2484"/>
+            <w:shd w:fill="FFFFFF"/>
+            <w:tcMar>
+              <w:top w:w="100" w:type="dxa"/>
+              <w:bottom w:w="100" w:type="dxa"/>
+              <w:left w:w="150" w:type="dxa"/>
+              <w:right w:w="150" w:type="dxa"/>
+            </w:tcMar>
+            <w:vAlign w:val="center"/>
+          </w:tcPr>
+          <w:p>
+            <w:pPr>
+              <w:spacing w:before="0" w:after="0"/>
+            </w:pPr>
+            <w:r>
+              <w:rPr>
+                <w:b w:val="0"/>
+                <w:sz w:val="18"/>
+              </w:rPr>
+              <w:t>104 losers (58.1%)</w:t>
+            </w:r>
+          </w:p>
+        </w:tc>
+        <w:tc>
+          <w:tcPr>
+            <w:tcW w:type="dxa" w:w="2484"/>
+            <w:shd w:fill="FFFFFF"/>
+            <w:tcMar>
+              <w:top w:w="100" w:type="dxa"/>
+              <w:bottom w:w="100" w:type="dxa"/>
+              <w:left w:w="150" w:type="dxa"/>
+              <w:right w:w="150" w:type="dxa"/>
+            </w:tcMar>
+            <w:vAlign w:val="center"/>
+          </w:tcPr>
+          <w:p>
+            <w:pPr>
+              <w:spacing w:before="0" w:after="0"/>
+            </w:pPr>
+            <w:r>
+              <w:rPr>
+                <w:b w:val="0"/>
+                <w:sz w:val="18"/>
+              </w:rPr>
+              <w:t>Unchanged</w:t>
+            </w:r>
+          </w:p>
+        </w:tc>
+      </w:tr>
+      <w:tr>
+        <w:tc>
+          <w:tcPr>
+            <w:tcW w:type="dxa" w:w="2484"/>
+            <w:shd w:fill="F8FAFC"/>
+            <w:tcMar>
+              <w:top w:w="100" w:type="dxa"/>
+              <w:bottom w:w="100" w:type="dxa"/>
+              <w:left w:w="150" w:type="dxa"/>
+              <w:right w:w="150" w:type="dxa"/>
+            </w:tcMar>
+            <w:vAlign w:val="center"/>
+          </w:tcPr>
+          <w:p>
+            <w:pPr>
+              <w:spacing w:before="0" w:after="0"/>
+            </w:pPr>
+            <w:r>
+              <w:rPr>
+                <w:b/>
+                <w:sz w:val="18"/>
+              </w:rPr>
+              <w:t>Gross Profit Generated</w:t>
+            </w:r>
+          </w:p>
+        </w:tc>
+        <w:tc>
+          <w:tcPr>
+            <w:tcW w:type="dxa" w:w="2484"/>
+            <w:shd w:fill="F8FAFC"/>
+            <w:tcMar>
+              <w:top w:w="100" w:type="dxa"/>
+              <w:bottom w:w="100" w:type="dxa"/>
+              <w:left w:w="150" w:type="dxa"/>
+              <w:right w:w="150" w:type="dxa"/>
+            </w:tcMar>
+            <w:vAlign w:val="center"/>
+          </w:tcPr>
+          <w:p>
+            <w:pPr>
+              <w:spacing w:before="0" w:after="0"/>
+            </w:pPr>
+            <w:r>
+              <w:rPr>
+                <w:b w:val="0"/>
+                <w:sz w:val="18"/>
+              </w:rPr>
+              <w:t>+12.0767 SOL</w:t>
+            </w:r>
+          </w:p>
+        </w:tc>
+        <w:tc>
+          <w:tcPr>
+            <w:tcW w:type="dxa" w:w="2484"/>
+            <w:shd w:fill="F8FAFC"/>
+            <w:tcMar>
+              <w:top w:w="100" w:type="dxa"/>
+              <w:bottom w:w="100" w:type="dxa"/>
+              <w:left w:w="150" w:type="dxa"/>
+              <w:right w:w="150" w:type="dxa"/>
+            </w:tcMar>
+            <w:vAlign w:val="center"/>
+          </w:tcPr>
+          <w:p>
+            <w:pPr>
+              <w:spacing w:before="0" w:after="0"/>
+            </w:pPr>
+            <w:r>
+              <w:rPr>
+                <w:b w:val="0"/>
+                <w:sz w:val="18"/>
+              </w:rPr>
+              <w:t>+11.3428 SOL</w:t>
+            </w:r>
+          </w:p>
+        </w:tc>
+        <w:tc>
+          <w:tcPr>
+            <w:tcW w:type="dxa" w:w="2484"/>
+            <w:shd w:fill="F8FAFC"/>
+            <w:tcMar>
+              <w:top w:w="100" w:type="dxa"/>
+              <w:bottom w:w="100" w:type="dxa"/>
+              <w:left w:w="150" w:type="dxa"/>
+              <w:right w:w="150" w:type="dxa"/>
+            </w:tcMar>
+            <w:vAlign w:val="center"/>
+          </w:tcPr>
+          <w:p>
+            <w:pPr>
+              <w:spacing w:before="0" w:after="0"/>
+            </w:pPr>
+            <w:r>
+              <w:rPr>
+                <w:b w:val="0"/>
+                <w:sz w:val="18"/>
+              </w:rPr>
+              <w:t>-0.7339 SOL (Tighter exits)</w:t>
+            </w:r>
+          </w:p>
+        </w:tc>
+      </w:tr>
+      <w:tr>
+        <w:tc>
+          <w:tcPr>
+            <w:tcW w:type="dxa" w:w="2484"/>
+            <w:shd w:fill="FFFFFF"/>
+            <w:tcMar>
+              <w:top w:w="100" w:type="dxa"/>
+              <w:bottom w:w="100" w:type="dxa"/>
+              <w:left w:w="150" w:type="dxa"/>
+              <w:right w:w="150" w:type="dxa"/>
+            </w:tcMar>
+            <w:vAlign w:val="center"/>
+          </w:tcPr>
+          <w:p>
+            <w:pPr>
+              <w:spacing w:before="0" w:after="0"/>
+            </w:pPr>
+            <w:r>
+              <w:rPr>
+                <w:b/>
+                <w:sz w:val="18"/>
+              </w:rPr>
+              <w:t>Gross Losses Incurred</w:t>
+            </w:r>
+          </w:p>
+        </w:tc>
+        <w:tc>
+          <w:tcPr>
+            <w:tcW w:type="dxa" w:w="2484"/>
+            <w:shd w:fill="FFFFFF"/>
+            <w:tcMar>
+              <w:top w:w="100" w:type="dxa"/>
+              <w:bottom w:w="100" w:type="dxa"/>
+              <w:left w:w="150" w:type="dxa"/>
+              <w:right w:w="150" w:type="dxa"/>
+            </w:tcMar>
+            <w:vAlign w:val="center"/>
+          </w:tcPr>
+          <w:p>
+            <w:pPr>
+              <w:spacing w:before="0" w:after="0"/>
+            </w:pPr>
+            <w:r>
+              <w:rPr>
+                <w:b w:val="0"/>
+                <w:sz w:val="18"/>
+              </w:rPr>
+              <w:t>-17.4459 SOL</w:t>
+            </w:r>
+          </w:p>
+        </w:tc>
+        <w:tc>
+          <w:tcPr>
+            <w:tcW w:type="dxa" w:w="2484"/>
+            <w:shd w:fill="FFFFFF"/>
+            <w:tcMar>
+              <w:top w:w="100" w:type="dxa"/>
+              <w:bottom w:w="100" w:type="dxa"/>
+              <w:left w:w="150" w:type="dxa"/>
+              <w:right w:w="150" w:type="dxa"/>
+            </w:tcMar>
+            <w:vAlign w:val="center"/>
+          </w:tcPr>
+          <w:p>
+            <w:pPr>
+              <w:spacing w:before="0" w:after="0"/>
+            </w:pPr>
+            <w:r>
+              <w:rPr>
+                <w:b/>
+                <w:sz w:val="18"/>
+              </w:rPr>
+              <w:t>-5.1152 SOL</w:t>
+            </w:r>
+          </w:p>
+        </w:tc>
+        <w:tc>
+          <w:tcPr>
+            <w:tcW w:type="dxa" w:w="2484"/>
+            <w:shd w:fill="FFFFFF"/>
+            <w:tcMar>
+              <w:top w:w="100" w:type="dxa"/>
+              <w:bottom w:w="100" w:type="dxa"/>
+              <w:left w:w="150" w:type="dxa"/>
+              <w:right w:w="150" w:type="dxa"/>
+            </w:tcMar>
+            <w:vAlign w:val="center"/>
+          </w:tcPr>
+          <w:p>
+            <w:pPr>
+              <w:spacing w:before="0" w:after="0"/>
+            </w:pPr>
+            <w:r>
+              <w:rPr>
+                <w:b/>
+                <w:sz w:val="18"/>
+              </w:rPr>
+              <w:t>-12.3307 SOL (-70.7\% loss reduction!)</w:t>
+            </w:r>
+          </w:p>
+        </w:tc>
+      </w:tr>
+      <w:tr>
+        <w:tc>
+          <w:tcPr>
+            <w:tcW w:type="dxa" w:w="2484"/>
+            <w:shd w:fill="F8FAFC"/>
+            <w:tcMar>
+              <w:top w:w="100" w:type="dxa"/>
+              <w:bottom w:w="100" w:type="dxa"/>
+              <w:left w:w="150" w:type="dxa"/>
+              <w:right w:w="150" w:type="dxa"/>
+            </w:tcMar>
+            <w:vAlign w:val="center"/>
+          </w:tcPr>
+          <w:p>
+            <w:pPr>
+              <w:spacing w:before="0" w:after="0"/>
+            </w:pPr>
+            <w:r>
+              <w:rPr>
+                <w:b/>
+                <w:sz w:val="18"/>
+              </w:rPr>
+              <w:t>Net Realized Cumulative PnL</w:t>
+            </w:r>
+          </w:p>
+        </w:tc>
+        <w:tc>
+          <w:tcPr>
+            <w:tcW w:type="dxa" w:w="2484"/>
+            <w:shd w:fill="F8FAFC"/>
+            <w:tcMar>
+              <w:top w:w="100" w:type="dxa"/>
+              <w:bottom w:w="100" w:type="dxa"/>
+              <w:left w:w="150" w:type="dxa"/>
+              <w:right w:w="150" w:type="dxa"/>
+            </w:tcMar>
+            <w:vAlign w:val="center"/>
+          </w:tcPr>
+          <w:p>
+            <w:pPr>
+              <w:spacing w:before="0" w:after="0"/>
+            </w:pPr>
+            <w:r>
+              <w:rPr>
+                <w:b/>
+                <w:sz w:val="18"/>
+              </w:rPr>
+              <w:t>-5.3692 SOL</w:t>
+            </w:r>
+          </w:p>
+        </w:tc>
+        <w:tc>
+          <w:tcPr>
+            <w:tcW w:type="dxa" w:w="2484"/>
+            <w:shd w:fill="F8FAFC"/>
+            <w:tcMar>
+              <w:top w:w="100" w:type="dxa"/>
+              <w:bottom w:w="100" w:type="dxa"/>
+              <w:left w:w="150" w:type="dxa"/>
+              <w:right w:w="150" w:type="dxa"/>
+            </w:tcMar>
+            <w:vAlign w:val="center"/>
+          </w:tcPr>
+          <w:p>
+            <w:pPr>
+              <w:spacing w:before="0" w:after="0"/>
+            </w:pPr>
+            <w:r>
+              <w:rPr>
+                <w:b/>
+                <w:sz w:val="18"/>
+              </w:rPr>
+              <w:t>+6.2274 SOL</w:t>
+            </w:r>
+          </w:p>
+        </w:tc>
+        <w:tc>
+          <w:tcPr>
+            <w:tcW w:type="dxa" w:w="2484"/>
+            <w:shd w:fill="F8FAFC"/>
+            <w:tcMar>
+              <w:top w:w="100" w:type="dxa"/>
+              <w:bottom w:w="100" w:type="dxa"/>
+              <w:left w:w="150" w:type="dxa"/>
+              <w:right w:w="150" w:type="dxa"/>
+            </w:tcMar>
+            <w:vAlign w:val="center"/>
+          </w:tcPr>
+          <w:p>
+            <w:pPr>
+              <w:spacing w:before="0" w:after="0"/>
+            </w:pPr>
+            <w:r>
+              <w:rPr>
+                <w:b/>
+                <w:sz w:val="18"/>
+              </w:rPr>
+              <w:t>+11.5966 SOL net turnaround!</w:t>
+            </w:r>
+          </w:p>
+        </w:tc>
+      </w:tr>
+      <w:tr>
+        <w:tc>
+          <w:tcPr>
+            <w:tcW w:type="dxa" w:w="2484"/>
+            <w:shd w:fill="FFFFFF"/>
+            <w:tcMar>
+              <w:top w:w="100" w:type="dxa"/>
+              <w:bottom w:w="100" w:type="dxa"/>
+              <w:left w:w="150" w:type="dxa"/>
+              <w:right w:w="150" w:type="dxa"/>
+            </w:tcMar>
+            <w:vAlign w:val="center"/>
+          </w:tcPr>
+          <w:p>
+            <w:pPr>
+              <w:spacing w:before="0" w:after="0"/>
+            </w:pPr>
+            <w:r>
+              <w:rPr>
+                <w:b/>
+                <w:sz w:val="18"/>
+              </w:rPr>
+              <w:t>Profit Factor</w:t>
+            </w:r>
+          </w:p>
+        </w:tc>
+        <w:tc>
+          <w:tcPr>
+            <w:tcW w:type="dxa" w:w="2484"/>
+            <w:shd w:fill="FFFFFF"/>
+            <w:tcMar>
+              <w:top w:w="100" w:type="dxa"/>
+              <w:bottom w:w="100" w:type="dxa"/>
+              <w:left w:w="150" w:type="dxa"/>
+              <w:right w:w="150" w:type="dxa"/>
+            </w:tcMar>
+            <w:vAlign w:val="center"/>
+          </w:tcPr>
+          <w:p>
+            <w:pPr>
+              <w:spacing w:before="0" w:after="0"/>
+            </w:pPr>
+            <w:r>
+              <w:rPr>
+                <w:b/>
+                <w:sz w:val="18"/>
+              </w:rPr>
+              <w:t>0.692</w:t>
+            </w:r>
+          </w:p>
+        </w:tc>
+        <w:tc>
+          <w:tcPr>
+            <w:tcW w:type="dxa" w:w="2484"/>
+            <w:shd w:fill="FFFFFF"/>
+            <w:tcMar>
+              <w:top w:w="100" w:type="dxa"/>
+              <w:bottom w:w="100" w:type="dxa"/>
+              <w:left w:w="150" w:type="dxa"/>
+              <w:right w:w="150" w:type="dxa"/>
+            </w:tcMar>
+            <w:vAlign w:val="center"/>
+          </w:tcPr>
+          <w:p>
+            <w:pPr>
+              <w:spacing w:before="0" w:after="0"/>
+            </w:pPr>
+            <w:r>
+              <w:rPr>
+                <w:b/>
+                <w:sz w:val="18"/>
+              </w:rPr>
+              <w:t>2.217</w:t>
+            </w:r>
+          </w:p>
+        </w:tc>
+        <w:tc>
+          <w:tcPr>
+            <w:tcW w:type="dxa" w:w="2484"/>
+            <w:shd w:fill="FFFFFF"/>
+            <w:tcMar>
+              <w:top w:w="100" w:type="dxa"/>
+              <w:bottom w:w="100" w:type="dxa"/>
+              <w:left w:w="150" w:type="dxa"/>
+              <w:right w:w="150" w:type="dxa"/>
+            </w:tcMar>
+            <w:vAlign w:val="center"/>
+          </w:tcPr>
+          <w:p>
+            <w:pPr>
+              <w:spacing w:before="0" w:after="0"/>
+            </w:pPr>
+            <w:r>
+              <w:rPr>
+                <w:b/>
+                <w:sz w:val="18"/>
+              </w:rPr>
+              <w:t>+1.525 (+220.4%)</w:t>
+            </w:r>
+          </w:p>
+        </w:tc>
+      </w:tr>
+      <w:tr>
+        <w:tc>
+          <w:tcPr>
+            <w:tcW w:type="dxa" w:w="2484"/>
+            <w:shd w:fill="F8FAFC"/>
+            <w:tcMar>
+              <w:top w:w="100" w:type="dxa"/>
+              <w:bottom w:w="100" w:type="dxa"/>
+              <w:left w:w="150" w:type="dxa"/>
+              <w:right w:w="150" w:type="dxa"/>
+            </w:tcMar>
+            <w:vAlign w:val="center"/>
+          </w:tcPr>
+          <w:p>
+            <w:pPr>
+              <w:spacing w:before="0" w:after="0"/>
+            </w:pPr>
+            <w:r>
+              <w:rPr>
+                <w:b/>
+                <w:sz w:val="18"/>
+              </w:rPr>
+              <w:t>Simulated 10 SOL Final Balance</w:t>
+            </w:r>
+          </w:p>
+        </w:tc>
+        <w:tc>
+          <w:tcPr>
+            <w:tcW w:type="dxa" w:w="2484"/>
+            <w:shd w:fill="F8FAFC"/>
+            <w:tcMar>
+              <w:top w:w="100" w:type="dxa"/>
+              <w:bottom w:w="100" w:type="dxa"/>
+              <w:left w:w="150" w:type="dxa"/>
+              <w:right w:w="150" w:type="dxa"/>
+            </w:tcMar>
+            <w:vAlign w:val="center"/>
+          </w:tcPr>
+          <w:p>
+            <w:pPr>
+              <w:spacing w:before="0" w:after="0"/>
+            </w:pPr>
+            <w:r>
+              <w:rPr>
+                <w:b w:val="0"/>
+                <w:sz w:val="18"/>
+              </w:rPr>
+              <w:t>4.6304 SOL</w:t>
+            </w:r>
+          </w:p>
+        </w:tc>
+        <w:tc>
+          <w:tcPr>
+            <w:tcW w:type="dxa" w:w="2484"/>
+            <w:shd w:fill="F8FAFC"/>
+            <w:tcMar>
+              <w:top w:w="100" w:type="dxa"/>
+              <w:bottom w:w="100" w:type="dxa"/>
+              <w:left w:w="150" w:type="dxa"/>
+              <w:right w:w="150" w:type="dxa"/>
+            </w:tcMar>
+            <w:vAlign w:val="center"/>
+          </w:tcPr>
+          <w:p>
+            <w:pPr>
+              <w:spacing w:before="0" w:after="0"/>
+            </w:pPr>
+            <w:r>
+              <w:rPr>
+                <w:b/>
+                <w:sz w:val="18"/>
+              </w:rPr>
+              <w:t>16.2274 SOL</w:t>
+            </w:r>
+          </w:p>
+        </w:tc>
+        <w:tc>
+          <w:tcPr>
+            <w:tcW w:type="dxa" w:w="2484"/>
+            <w:shd w:fill="F8FAFC"/>
+            <w:tcMar>
+              <w:top w:w="100" w:type="dxa"/>
+              <w:bottom w:w="100" w:type="dxa"/>
+              <w:left w:w="150" w:type="dxa"/>
+              <w:right w:w="150" w:type="dxa"/>
+            </w:tcMar>
+            <w:vAlign w:val="center"/>
+          </w:tcPr>
+          <w:p>
+            <w:pPr>
+              <w:spacing w:before="0" w:after="0"/>
+            </w:pPr>
+            <w:r>
+              <w:rPr>
+                <w:b/>
+                <w:sz w:val="18"/>
+              </w:rPr>
+              <w:t>+11.5970 SOL</w:t>
+            </w:r>
+          </w:p>
+        </w:tc>
+      </w:tr>
+      <w:tr>
+        <w:tc>
+          <w:tcPr>
+            <w:tcW w:type="dxa" w:w="2484"/>
+            <w:shd w:fill="FFFFFF"/>
+            <w:tcMar>
+              <w:top w:w="100" w:type="dxa"/>
+              <w:bottom w:w="100" w:type="dxa"/>
+              <w:left w:w="150" w:type="dxa"/>
+              <w:right w:w="150" w:type="dxa"/>
+            </w:tcMar>
+            <w:vAlign w:val="center"/>
+          </w:tcPr>
+          <w:p>
+            <w:pPr>
+              <w:spacing w:before="0" w:after="0"/>
+            </w:pPr>
+            <w:r>
+              <w:rPr>
+                <w:b/>
+                <w:sz w:val="18"/>
+              </w:rPr>
+              <w:t>Compounded 10 SOL Final Balance</w:t>
+            </w:r>
+          </w:p>
+        </w:tc>
+        <w:tc>
+          <w:tcPr>
+            <w:tcW w:type="dxa" w:w="2484"/>
+            <w:shd w:fill="FFFFFF"/>
+            <w:tcMar>
+              <w:top w:w="100" w:type="dxa"/>
+              <w:bottom w:w="100" w:type="dxa"/>
+              <w:left w:w="150" w:type="dxa"/>
+              <w:right w:w="150" w:type="dxa"/>
+            </w:tcMar>
+            <w:vAlign w:val="center"/>
+          </w:tcPr>
+          <w:p>
+            <w:pPr>
+              <w:spacing w:before="0" w:after="0"/>
+            </w:pPr>
+            <w:r>
+              <w:rPr>
+                <w:b w:val="0"/>
+                <w:sz w:val="18"/>
+              </w:rPr>
+              <w:t>4.6304 SOL</w:t>
+            </w:r>
+          </w:p>
+        </w:tc>
+        <w:tc>
+          <w:tcPr>
+            <w:tcW w:type="dxa" w:w="2484"/>
+            <w:shd w:fill="FFFFFF"/>
+            <w:tcMar>
+              <w:top w:w="100" w:type="dxa"/>
+              <w:bottom w:w="100" w:type="dxa"/>
+              <w:left w:w="150" w:type="dxa"/>
+              <w:right w:w="150" w:type="dxa"/>
+            </w:tcMar>
+            <w:vAlign w:val="center"/>
+          </w:tcPr>
+          <w:p>
+            <w:pPr>
+              <w:spacing w:before="0" w:after="0"/>
+            </w:pPr>
+            <w:r>
+              <w:rPr>
+                <w:b/>
+                <w:sz w:val="18"/>
+              </w:rPr>
+              <w:t>18.1495 SOL</w:t>
+            </w:r>
+          </w:p>
+        </w:tc>
+        <w:tc>
+          <w:tcPr>
+            <w:tcW w:type="dxa" w:w="2484"/>
+            <w:shd w:fill="FFFFFF"/>
+            <w:tcMar>
+              <w:top w:w="100" w:type="dxa"/>
+              <w:bottom w:w="100" w:type="dxa"/>
+              <w:left w:w="150" w:type="dxa"/>
+              <w:right w:w="150" w:type="dxa"/>
+            </w:tcMar>
+            <w:vAlign w:val="center"/>
+          </w:tcPr>
+          <w:p>
+            <w:pPr>
+              <w:spacing w:before="0" w:after="0"/>
+            </w:pPr>
+            <w:r>
+              <w:rPr>
+                <w:b/>
+                <w:sz w:val="18"/>
+              </w:rPr>
+              <w:t>+13.5191 SOL (+81.5%)</w:t>
+            </w:r>
+          </w:p>
+        </w:tc>
+      </w:tr>
+    </w:tbl>
+    <w:p>
+      <w:pPr>
+        <w:spacing w:after="80"/>
+      </w:pPr>
+    </w:p>
+    <w:p>
+      <w:pPr>
+        <w:spacing w:before="160" w:after="160"/>
+        <w:pBdr>
+          <w:bottom w:val="single" w:sz="6" w:space="1" w:color="CBD5E1"/>
+        </w:pBdr>
+      </w:pPr>
+    </w:p>
+    <w:p>
+      <w:pPr>
+        <w:spacing w:before="280" w:after="80"/>
+      </w:pPr>
+      <w:r>
+        <w:rPr>
+          <w:rFonts w:ascii="Calibri" w:hAnsi="Calibri"/>
+          <w:b/>
+          <w:color w:val="1E293B"/>
+          <w:sz w:val="32"/>
+        </w:rPr>
+        <w:t>10. Comprehensive Strategy Gate Reference Matrix</w:t>
       </w:r>
     </w:p>
     <w:tbl>
@@ -5902,7 +7410,7 @@
                 <w:b w:val="0"/>
                 <w:sz w:val="18"/>
               </w:rPr>
-              <w:t>Allocate 0.50 SOL (0.25 SOL micro)</w:t>
+              <w:t>Allocate 0.50 SOL (0.35 SOL micro)</w:t>
             </w:r>
           </w:p>
         </w:tc>
@@ -6106,7 +7614,7 @@
                 <w:b/>
                 <w:sz w:val="18"/>
               </w:rPr>
-              <w:t>Fakeout Scale-In Denied</w:t>
+              <w:t>Scaled Breakeven Shield</w:t>
             </w:r>
           </w:p>
         </w:tc>
@@ -6131,7 +7639,7 @@
                 <w:b w:val="0"/>
                 <w:sz w:val="18"/>
               </w:rPr>
-              <w:t>Gain ≥ +7\%, volume stalls</w:t>
+              <w:t>Retraces to blended basis ≤ 0.0\%</w:t>
             </w:r>
           </w:p>
         </w:tc>
@@ -6156,6 +7664,141 @@
                 <w:b w:val="0"/>
                 <w:sz w:val="18"/>
               </w:rPr>
+              <w:t xml:space="preserve">Exit All: </w:t>
+            </w:r>
+            <w:r>
+              <w:rPr>
+                <w:rFonts w:ascii="Consolas" w:hAnsi="Consolas"/>
+                <w:color w:val="B42828"/>
+                <w:sz w:val="16"/>
+              </w:rPr>
+              <w:t>SCALED_BREAKEVEN_EXIT</w:t>
+            </w:r>
+          </w:p>
+        </w:tc>
+        <w:tc>
+          <w:tcPr>
+            <w:tcW w:type="dxa" w:w="1987"/>
+            <w:shd w:fill="F8FAFC"/>
+            <w:tcMar>
+              <w:top w:w="100" w:type="dxa"/>
+              <w:bottom w:w="100" w:type="dxa"/>
+              <w:left w:w="150" w:type="dxa"/>
+              <w:right w:w="150" w:type="dxa"/>
+            </w:tcMar>
+            <w:vAlign w:val="center"/>
+          </w:tcPr>
+          <w:p>
+            <w:pPr>
+              <w:spacing w:before="0" w:after="0"/>
+            </w:pPr>
+            <w:r>
+              <w:rPr>
+                <w:b w:val="0"/>
+                <w:sz w:val="18"/>
+              </w:rPr>
+              <w:t>Prevents loss on scaled-in position</w:t>
+            </w:r>
+          </w:p>
+        </w:tc>
+      </w:tr>
+      <w:tr>
+        <w:tc>
+          <w:tcPr>
+            <w:tcW w:type="dxa" w:w="1987"/>
+            <w:shd w:fill="FFFFFF"/>
+            <w:tcMar>
+              <w:top w:w="100" w:type="dxa"/>
+              <w:bottom w:w="100" w:type="dxa"/>
+              <w:left w:w="150" w:type="dxa"/>
+              <w:right w:w="150" w:type="dxa"/>
+            </w:tcMar>
+            <w:vAlign w:val="center"/>
+          </w:tcPr>
+          <w:p>
+            <w:pPr>
+              <w:spacing w:before="0" w:after="0"/>
+            </w:pPr>
+            <w:r>
+              <w:rPr>
+                <w:b/>
+                <w:sz w:val="18"/>
+              </w:rPr>
+              <w:t>4.3</w:t>
+            </w:r>
+          </w:p>
+        </w:tc>
+        <w:tc>
+          <w:tcPr>
+            <w:tcW w:type="dxa" w:w="1987"/>
+            <w:shd w:fill="FFFFFF"/>
+            <w:tcMar>
+              <w:top w:w="100" w:type="dxa"/>
+              <w:bottom w:w="100" w:type="dxa"/>
+              <w:left w:w="150" w:type="dxa"/>
+              <w:right w:w="150" w:type="dxa"/>
+            </w:tcMar>
+            <w:vAlign w:val="center"/>
+          </w:tcPr>
+          <w:p>
+            <w:pPr>
+              <w:spacing w:before="0" w:after="0"/>
+            </w:pPr>
+            <w:r>
+              <w:rPr>
+                <w:b/>
+                <w:sz w:val="18"/>
+              </w:rPr>
+              <w:t>Fakeout Scale-In Denied</w:t>
+            </w:r>
+          </w:p>
+        </w:tc>
+        <w:tc>
+          <w:tcPr>
+            <w:tcW w:type="dxa" w:w="1987"/>
+            <w:shd w:fill="FFFFFF"/>
+            <w:tcMar>
+              <w:top w:w="100" w:type="dxa"/>
+              <w:bottom w:w="100" w:type="dxa"/>
+              <w:left w:w="150" w:type="dxa"/>
+              <w:right w:w="150" w:type="dxa"/>
+            </w:tcMar>
+            <w:vAlign w:val="center"/>
+          </w:tcPr>
+          <w:p>
+            <w:pPr>
+              <w:spacing w:before="0" w:after="0"/>
+            </w:pPr>
+            <w:r>
+              <w:rPr>
+                <w:b w:val="0"/>
+                <w:sz w:val="18"/>
+              </w:rPr>
+              <w:t>Gain ≥ +7\%, volume stalls</w:t>
+            </w:r>
+          </w:p>
+        </w:tc>
+        <w:tc>
+          <w:tcPr>
+            <w:tcW w:type="dxa" w:w="1987"/>
+            <w:shd w:fill="FFFFFF"/>
+            <w:tcMar>
+              <w:top w:w="100" w:type="dxa"/>
+              <w:bottom w:w="100" w:type="dxa"/>
+              <w:left w:w="150" w:type="dxa"/>
+              <w:right w:w="150" w:type="dxa"/>
+            </w:tcMar>
+            <w:vAlign w:val="center"/>
+          </w:tcPr>
+          <w:p>
+            <w:pPr>
+              <w:spacing w:before="0" w:after="0"/>
+            </w:pPr>
+            <w:r>
+              <w:rPr>
+                <w:b w:val="0"/>
+                <w:sz w:val="18"/>
+              </w:rPr>
               <w:t>Deny Scale-In (Hold 0.50 SOL)</w:t>
             </w:r>
           </w:p>
@@ -6163,7 +7806,7 @@
         <w:tc>
           <w:tcPr>
             <w:tcW w:type="dxa" w:w="1987"/>
-            <w:shd w:fill="F8FAFC"/>
+            <w:shd w:fill="FFFFFF"/>
             <w:tcMar>
               <w:top w:w="100" w:type="dxa"/>
               <w:bottom w:w="100" w:type="dxa"/>
@@ -6190,7 +7833,7 @@
         <w:tc>
           <w:tcPr>
             <w:tcW w:type="dxa" w:w="1987"/>
-            <w:shd w:fill="FFFFFF"/>
+            <w:shd w:fill="F8FAFC"/>
             <w:tcMar>
               <w:top w:w="100" w:type="dxa"/>
               <w:bottom w:w="100" w:type="dxa"/>
@@ -6215,7 +7858,7 @@
         <w:tc>
           <w:tcPr>
             <w:tcW w:type="dxa" w:w="1987"/>
-            <w:shd w:fill="FFFFFF"/>
+            <w:shd w:fill="F8FAFC"/>
             <w:tcMar>
               <w:top w:w="100" w:type="dxa"/>
               <w:bottom w:w="100" w:type="dxa"/>
@@ -6240,6 +7883,141 @@
         <w:tc>
           <w:tcPr>
             <w:tcW w:type="dxa" w:w="1987"/>
+            <w:shd w:fill="F8FAFC"/>
+            <w:tcMar>
+              <w:top w:w="100" w:type="dxa"/>
+              <w:bottom w:w="100" w:type="dxa"/>
+              <w:left w:w="150" w:type="dxa"/>
+              <w:right w:w="150" w:type="dxa"/>
+            </w:tcMar>
+            <w:vAlign w:val="center"/>
+          </w:tcPr>
+          <w:p>
+            <w:pPr>
+              <w:spacing w:before="0" w:after="0"/>
+            </w:pPr>
+            <w:r>
+              <w:rPr>
+                <w:b w:val="0"/>
+                <w:sz w:val="18"/>
+              </w:rPr>
+              <w:t>Peak &lt; +1.0\%, P/L ≤ -12.0\%</w:t>
+            </w:r>
+          </w:p>
+        </w:tc>
+        <w:tc>
+          <w:tcPr>
+            <w:tcW w:type="dxa" w:w="1987"/>
+            <w:shd w:fill="F8FAFC"/>
+            <w:tcMar>
+              <w:top w:w="100" w:type="dxa"/>
+              <w:bottom w:w="100" w:type="dxa"/>
+              <w:left w:w="150" w:type="dxa"/>
+              <w:right w:w="150" w:type="dxa"/>
+            </w:tcMar>
+            <w:vAlign w:val="center"/>
+          </w:tcPr>
+          <w:p>
+            <w:pPr>
+              <w:spacing w:before="0" w:after="0"/>
+            </w:pPr>
+            <w:r>
+              <w:rPr>
+                <w:b w:val="0"/>
+                <w:sz w:val="18"/>
+              </w:rPr>
+              <w:t xml:space="preserve">Exit All: </w:t>
+            </w:r>
+            <w:r>
+              <w:rPr>
+                <w:rFonts w:ascii="Consolas" w:hAnsi="Consolas"/>
+                <w:color w:val="B42828"/>
+                <w:sz w:val="16"/>
+              </w:rPr>
+              <w:t>PROBE_UNCONFIRMED_DUMP_CUT</w:t>
+            </w:r>
+          </w:p>
+        </w:tc>
+        <w:tc>
+          <w:tcPr>
+            <w:tcW w:type="dxa" w:w="1987"/>
+            <w:shd w:fill="F8FAFC"/>
+            <w:tcMar>
+              <w:top w:w="100" w:type="dxa"/>
+              <w:bottom w:w="100" w:type="dxa"/>
+              <w:left w:w="150" w:type="dxa"/>
+              <w:right w:w="150" w:type="dxa"/>
+            </w:tcMar>
+            <w:vAlign w:val="center"/>
+          </w:tcPr>
+          <w:p>
+            <w:pPr>
+              <w:spacing w:before="0" w:after="0"/>
+            </w:pPr>
+            <w:r>
+              <w:rPr>
+                <w:b w:val="0"/>
+                <w:sz w:val="18"/>
+              </w:rPr>
+              <w:t>Halts unconfirmed probe bleedouts</w:t>
+            </w:r>
+          </w:p>
+        </w:tc>
+      </w:tr>
+      <w:tr>
+        <w:tc>
+          <w:tcPr>
+            <w:tcW w:type="dxa" w:w="1987"/>
+            <w:shd w:fill="FFFFFF"/>
+            <w:tcMar>
+              <w:top w:w="100" w:type="dxa"/>
+              <w:bottom w:w="100" w:type="dxa"/>
+              <w:left w:w="150" w:type="dxa"/>
+              <w:right w:w="150" w:type="dxa"/>
+            </w:tcMar>
+            <w:vAlign w:val="center"/>
+          </w:tcPr>
+          <w:p>
+            <w:pPr>
+              <w:spacing w:before="0" w:after="0"/>
+            </w:pPr>
+            <w:r>
+              <w:rPr>
+                <w:b/>
+                <w:sz w:val="18"/>
+              </w:rPr>
+              <w:t>5.2</w:t>
+            </w:r>
+          </w:p>
+        </w:tc>
+        <w:tc>
+          <w:tcPr>
+            <w:tcW w:type="dxa" w:w="1987"/>
+            <w:shd w:fill="FFFFFF"/>
+            <w:tcMar>
+              <w:top w:w="100" w:type="dxa"/>
+              <w:bottom w:w="100" w:type="dxa"/>
+              <w:left w:w="150" w:type="dxa"/>
+              <w:right w:w="150" w:type="dxa"/>
+            </w:tcMar>
+            <w:vAlign w:val="center"/>
+          </w:tcPr>
+          <w:p>
+            <w:pPr>
+              <w:spacing w:before="0" w:after="0"/>
+            </w:pPr>
+            <w:r>
+              <w:rPr>
+                <w:b/>
+                <w:sz w:val="18"/>
+              </w:rPr>
+              <w:t>Pre-Breakeven Stop</w:t>
+            </w:r>
+          </w:p>
+        </w:tc>
+        <w:tc>
+          <w:tcPr>
+            <w:tcW w:type="dxa" w:w="1987"/>
             <w:shd w:fill="FFFFFF"/>
             <w:tcMar>
               <w:top w:w="100" w:type="dxa"/>
@@ -6258,7 +8036,7 @@
                 <w:b w:val="0"/>
                 <w:sz w:val="18"/>
               </w:rPr>
-              <w:t>Peak &lt; +1.0\%, P/L ≤ -12.0\%</w:t>
+              <w:t>No armed breakeven, P/L ≤ -12.0\%</w:t>
             </w:r>
           </w:p>
         </w:tc>
@@ -6291,7 +8069,7 @@
                 <w:color w:val="B42828"/>
                 <w:sz w:val="16"/>
               </w:rPr>
-              <w:t>PROBE_UNCONFIRMED_DUMP_CUT</w:t>
+              <w:t>UNCONFIRMED_PRE_BREAKEVEN_CUT</w:t>
             </w:r>
           </w:p>
         </w:tc>
@@ -6316,7 +8094,7 @@
                 <w:b w:val="0"/>
                 <w:sz w:val="18"/>
               </w:rPr>
-              <w:t>Halts unconfirmed probe bleedouts</w:t>
+              <w:t>Cuts underwater trades lacking strong flow</w:t>
             </w:r>
           </w:p>
         </w:tc>
@@ -6343,7 +8121,7 @@
                 <w:b/>
                 <w:sz w:val="18"/>
               </w:rPr>
-              <w:t>5.2</w:t>
+              <w:t>5.3</w:t>
             </w:r>
           </w:p>
         </w:tc>
@@ -6478,7 +8256,7 @@
                 <w:b/>
                 <w:sz w:val="18"/>
               </w:rPr>
-              <w:t>5.3</w:t>
+              <w:t>5.4</w:t>
             </w:r>
           </w:p>
         </w:tc>
@@ -6613,7 +8391,7 @@
                 <w:b/>
                 <w:sz w:val="18"/>
               </w:rPr>
-              <w:t>5.4</w:t>
+              <w:t>5.5</w:t>
             </w:r>
           </w:p>
         </w:tc>
@@ -6748,7 +8526,7 @@
                 <w:b/>
                 <w:sz w:val="18"/>
               </w:rPr>
-              <w:t>5.5</w:t>
+              <w:t>5.6</w:t>
             </w:r>
           </w:p>
         </w:tc>
@@ -6875,7 +8653,7 @@
                 <w:b/>
                 <w:sz w:val="18"/>
               </w:rPr>
-              <w:t>5.6</w:t>
+              <w:t>5.7</w:t>
             </w:r>
           </w:p>
         </w:tc>
@@ -7002,7 +8780,7 @@
                 <w:b/>
                 <w:sz w:val="18"/>
               </w:rPr>
-              <w:t>5.7</w:t>
+              <w:t>5.8</w:t>
             </w:r>
           </w:p>
         </w:tc>
@@ -7027,7 +8805,7 @@
                 <w:b/>
                 <w:sz w:val="18"/>
               </w:rPr>
-              <w:t>Tier 2 Take-Profit</w:t>
+              <w:t>Moonbag Capital Guard</w:t>
             </w:r>
           </w:p>
         </w:tc>
@@ -7052,7 +8830,7 @@
                 <w:b w:val="0"/>
                 <w:sz w:val="18"/>
               </w:rPr>
-              <w:t>Peak ≥ +48.5\%</w:t>
+              <w:t>Post-T1 drop ≤ -2.0\% / 0.0\%</w:t>
             </w:r>
           </w:p>
         </w:tc>
@@ -7077,6 +8855,156 @@
                 <w:b w:val="0"/>
                 <w:sz w:val="18"/>
               </w:rPr>
+              <w:t xml:space="preserve">Exit Remainder: </w:t>
+            </w:r>
+            <w:r>
+              <w:rPr>
+                <w:rFonts w:ascii="Consolas" w:hAnsi="Consolas"/>
+                <w:color w:val="B42828"/>
+                <w:sz w:val="16"/>
+              </w:rPr>
+              <w:t>MOONBAG_PROTECTION_EXIT</w:t>
+            </w:r>
+          </w:p>
+        </w:tc>
+        <w:tc>
+          <w:tcPr>
+            <w:tcW w:type="dxa" w:w="1987"/>
+            <w:shd w:fill="FFFFFF"/>
+            <w:tcMar>
+              <w:top w:w="100" w:type="dxa"/>
+              <w:bottom w:w="100" w:type="dxa"/>
+              <w:left w:w="150" w:type="dxa"/>
+              <w:right w:w="150" w:type="dxa"/>
+            </w:tcMar>
+            <w:vAlign w:val="center"/>
+          </w:tcPr>
+          <w:p>
+            <w:pPr>
+              <w:spacing w:before="0" w:after="0"/>
+            </w:pPr>
+            <w:r>
+              <w:rPr>
+                <w:b w:val="0"/>
+                <w:sz w:val="18"/>
+              </w:rPr>
+              <w:t>Prevents winner turning red (</w:t>
+            </w:r>
+            <w:r>
+              <w:rPr>
+                <w:rFonts w:ascii="Consolas" w:hAnsi="Consolas"/>
+                <w:color w:val="B42828"/>
+                <w:sz w:val="16"/>
+              </w:rPr>
+              <w:t>Cbenz</w:t>
+            </w:r>
+            <w:r>
+              <w:rPr>
+                <w:b w:val="0"/>
+                <w:sz w:val="18"/>
+              </w:rPr>
+              <w:t xml:space="preserve"> fix)</w:t>
+            </w:r>
+          </w:p>
+        </w:tc>
+      </w:tr>
+      <w:tr>
+        <w:tc>
+          <w:tcPr>
+            <w:tcW w:type="dxa" w:w="1987"/>
+            <w:shd w:fill="F8FAFC"/>
+            <w:tcMar>
+              <w:top w:w="100" w:type="dxa"/>
+              <w:bottom w:w="100" w:type="dxa"/>
+              <w:left w:w="150" w:type="dxa"/>
+              <w:right w:w="150" w:type="dxa"/>
+            </w:tcMar>
+            <w:vAlign w:val="center"/>
+          </w:tcPr>
+          <w:p>
+            <w:pPr>
+              <w:spacing w:before="0" w:after="0"/>
+            </w:pPr>
+            <w:r>
+              <w:rPr>
+                <w:b/>
+                <w:sz w:val="18"/>
+              </w:rPr>
+              <w:t>5.9</w:t>
+            </w:r>
+          </w:p>
+        </w:tc>
+        <w:tc>
+          <w:tcPr>
+            <w:tcW w:type="dxa" w:w="1987"/>
+            <w:shd w:fill="F8FAFC"/>
+            <w:tcMar>
+              <w:top w:w="100" w:type="dxa"/>
+              <w:bottom w:w="100" w:type="dxa"/>
+              <w:left w:w="150" w:type="dxa"/>
+              <w:right w:w="150" w:type="dxa"/>
+            </w:tcMar>
+            <w:vAlign w:val="center"/>
+          </w:tcPr>
+          <w:p>
+            <w:pPr>
+              <w:spacing w:before="0" w:after="0"/>
+            </w:pPr>
+            <w:r>
+              <w:rPr>
+                <w:b/>
+                <w:sz w:val="18"/>
+              </w:rPr>
+              <w:t>Tier 2 Take-Profit</w:t>
+            </w:r>
+          </w:p>
+        </w:tc>
+        <w:tc>
+          <w:tcPr>
+            <w:tcW w:type="dxa" w:w="1987"/>
+            <w:shd w:fill="F8FAFC"/>
+            <w:tcMar>
+              <w:top w:w="100" w:type="dxa"/>
+              <w:bottom w:w="100" w:type="dxa"/>
+              <w:left w:w="150" w:type="dxa"/>
+              <w:right w:w="150" w:type="dxa"/>
+            </w:tcMar>
+            <w:vAlign w:val="center"/>
+          </w:tcPr>
+          <w:p>
+            <w:pPr>
+              <w:spacing w:before="0" w:after="0"/>
+            </w:pPr>
+            <w:r>
+              <w:rPr>
+                <w:b w:val="0"/>
+                <w:sz w:val="18"/>
+              </w:rPr>
+              <w:t>Peak ≥ +48.5\%</w:t>
+            </w:r>
+          </w:p>
+        </w:tc>
+        <w:tc>
+          <w:tcPr>
+            <w:tcW w:type="dxa" w:w="1987"/>
+            <w:shd w:fill="F8FAFC"/>
+            <w:tcMar>
+              <w:top w:w="100" w:type="dxa"/>
+              <w:bottom w:w="100" w:type="dxa"/>
+              <w:left w:w="150" w:type="dxa"/>
+              <w:right w:w="150" w:type="dxa"/>
+            </w:tcMar>
+            <w:vAlign w:val="center"/>
+          </w:tcPr>
+          <w:p>
+            <w:pPr>
+              <w:spacing w:before="0" w:after="0"/>
+            </w:pPr>
+            <w:r>
+              <w:rPr>
+                <w:b w:val="0"/>
+                <w:sz w:val="18"/>
+              </w:rPr>
               <w:t>Sell 25\%, lock floor at +35.0\%</w:t>
             </w:r>
           </w:p>
@@ -7084,7 +9012,7 @@
         <w:tc>
           <w:tcPr>
             <w:tcW w:type="dxa" w:w="1987"/>
-            <w:shd w:fill="FFFFFF"/>
+            <w:shd w:fill="F8FAFC"/>
             <w:tcMar>
               <w:top w:w="100" w:type="dxa"/>
               <w:bottom w:w="100" w:type="dxa"/>
@@ -7111,7 +9039,7 @@
         <w:tc>
           <w:tcPr>
             <w:tcW w:type="dxa" w:w="1987"/>
-            <w:shd w:fill="F8FAFC"/>
+            <w:shd w:fill="FFFFFF"/>
             <w:tcMar>
               <w:top w:w="100" w:type="dxa"/>
               <w:bottom w:w="100" w:type="dxa"/>
@@ -7129,14 +9057,14 @@
                 <w:b/>
                 <w:sz w:val="18"/>
               </w:rPr>
-              <w:t>5.8</w:t>
+              <w:t>5.10</w:t>
             </w:r>
           </w:p>
         </w:tc>
         <w:tc>
           <w:tcPr>
             <w:tcW w:type="dxa" w:w="1987"/>
-            <w:shd w:fill="F8FAFC"/>
+            <w:shd w:fill="FFFFFF"/>
             <w:tcMar>
               <w:top w:w="100" w:type="dxa"/>
               <w:bottom w:w="100" w:type="dxa"/>
@@ -7161,7 +9089,7 @@
         <w:tc>
           <w:tcPr>
             <w:tcW w:type="dxa" w:w="1987"/>
-            <w:shd w:fill="F8FAFC"/>
+            <w:shd w:fill="FFFFFF"/>
             <w:tcMar>
               <w:top w:w="100" w:type="dxa"/>
               <w:bottom w:w="100" w:type="dxa"/>
@@ -7186,7 +9114,7 @@
         <w:tc>
           <w:tcPr>
             <w:tcW w:type="dxa" w:w="1987"/>
-            <w:shd w:fill="F8FAFC"/>
+            <w:shd w:fill="FFFFFF"/>
             <w:tcMar>
               <w:top w:w="100" w:type="dxa"/>
               <w:bottom w:w="100" w:type="dxa"/>
@@ -7219,7 +9147,7 @@
         <w:tc>
           <w:tcPr>
             <w:tcW w:type="dxa" w:w="1987"/>
-            <w:shd w:fill="F8FAFC"/>
+            <w:shd w:fill="FFFFFF"/>
             <w:tcMar>
               <w:top w:w="100" w:type="dxa"/>
               <w:bottom w:w="100" w:type="dxa"/>
@@ -7246,7 +9174,7 @@
         <w:tc>
           <w:tcPr>
             <w:tcW w:type="dxa" w:w="1987"/>
-            <w:shd w:fill="FFFFFF"/>
+            <w:shd w:fill="F8FAFC"/>
             <w:tcMar>
               <w:top w:w="100" w:type="dxa"/>
               <w:bottom w:w="100" w:type="dxa"/>
@@ -7271,7 +9199,7 @@
         <w:tc>
           <w:tcPr>
             <w:tcW w:type="dxa" w:w="1987"/>
-            <w:shd w:fill="FFFFFF"/>
+            <w:shd w:fill="F8FAFC"/>
             <w:tcMar>
               <w:top w:w="100" w:type="dxa"/>
               <w:bottom w:w="100" w:type="dxa"/>
@@ -7296,7 +9224,7 @@
         <w:tc>
           <w:tcPr>
             <w:tcW w:type="dxa" w:w="1987"/>
-            <w:shd w:fill="FFFFFF"/>
+            <w:shd w:fill="F8FAFC"/>
             <w:tcMar>
               <w:top w:w="100" w:type="dxa"/>
               <w:bottom w:w="100" w:type="dxa"/>
@@ -7321,7 +9249,7 @@
         <w:tc>
           <w:tcPr>
             <w:tcW w:type="dxa" w:w="1987"/>
-            <w:shd w:fill="FFFFFF"/>
+            <w:shd w:fill="F8FAFC"/>
             <w:tcMar>
               <w:top w:w="100" w:type="dxa"/>
               <w:bottom w:w="100" w:type="dxa"/>
@@ -7354,7 +9282,7 @@
         <w:tc>
           <w:tcPr>
             <w:tcW w:type="dxa" w:w="1987"/>
-            <w:shd w:fill="FFFFFF"/>
+            <w:shd w:fill="F8FAFC"/>
             <w:tcMar>
               <w:top w:w="100" w:type="dxa"/>
               <w:bottom w:w="100" w:type="dxa"/>
@@ -7381,7 +9309,7 @@
         <w:tc>
           <w:tcPr>
             <w:tcW w:type="dxa" w:w="1987"/>
-            <w:shd w:fill="F8FAFC"/>
+            <w:shd w:fill="FFFFFF"/>
             <w:tcMar>
               <w:top w:w="100" w:type="dxa"/>
               <w:bottom w:w="100" w:type="dxa"/>
@@ -7406,7 +9334,7 @@
         <w:tc>
           <w:tcPr>
             <w:tcW w:type="dxa" w:w="1987"/>
-            <w:shd w:fill="F8FAFC"/>
+            <w:shd w:fill="FFFFFF"/>
             <w:tcMar>
               <w:top w:w="100" w:type="dxa"/>
               <w:bottom w:w="100" w:type="dxa"/>
@@ -7431,7 +9359,7 @@
         <w:tc>
           <w:tcPr>
             <w:tcW w:type="dxa" w:w="1987"/>
-            <w:shd w:fill="F8FAFC"/>
+            <w:shd w:fill="FFFFFF"/>
             <w:tcMar>
               <w:top w:w="100" w:type="dxa"/>
               <w:bottom w:w="100" w:type="dxa"/>
@@ -7456,7 +9384,7 @@
         <w:tc>
           <w:tcPr>
             <w:tcW w:type="dxa" w:w="1987"/>
-            <w:shd w:fill="F8FAFC"/>
+            <w:shd w:fill="FFFFFF"/>
             <w:tcMar>
               <w:top w:w="100" w:type="dxa"/>
               <w:bottom w:w="100" w:type="dxa"/>
@@ -7481,7 +9409,7 @@
         <w:tc>
           <w:tcPr>
             <w:tcW w:type="dxa" w:w="1987"/>
-            <w:shd w:fill="F8FAFC"/>
+            <w:shd w:fill="FFFFFF"/>
             <w:tcMar>
               <w:top w:w="100" w:type="dxa"/>
               <w:bottom w:w="100" w:type="dxa"/>
@@ -7508,7 +9436,7 @@
         <w:tc>
           <w:tcPr>
             <w:tcW w:type="dxa" w:w="1987"/>
-            <w:shd w:fill="FFFFFF"/>
+            <w:shd w:fill="F8FAFC"/>
             <w:tcMar>
               <w:top w:w="100" w:type="dxa"/>
               <w:bottom w:w="100" w:type="dxa"/>
@@ -7533,7 +9461,7 @@
         <w:tc>
           <w:tcPr>
             <w:tcW w:type="dxa" w:w="1987"/>
-            <w:shd w:fill="FFFFFF"/>
+            <w:shd w:fill="F8FAFC"/>
             <w:tcMar>
               <w:top w:w="100" w:type="dxa"/>
               <w:bottom w:w="100" w:type="dxa"/>
@@ -7558,7 +9486,7 @@
         <w:tc>
           <w:tcPr>
             <w:tcW w:type="dxa" w:w="1987"/>
-            <w:shd w:fill="FFFFFF"/>
+            <w:shd w:fill="F8FAFC"/>
             <w:tcMar>
               <w:top w:w="100" w:type="dxa"/>
               <w:bottom w:w="100" w:type="dxa"/>
@@ -7583,7 +9511,7 @@
         <w:tc>
           <w:tcPr>
             <w:tcW w:type="dxa" w:w="1987"/>
-            <w:shd w:fill="FFFFFF"/>
+            <w:shd w:fill="F8FAFC"/>
             <w:tcMar>
               <w:top w:w="100" w:type="dxa"/>
               <w:bottom w:w="100" w:type="dxa"/>
@@ -7616,6 +9544,83 @@
         <w:tc>
           <w:tcPr>
             <w:tcW w:type="dxa" w:w="1987"/>
+            <w:shd w:fill="F8FAFC"/>
+            <w:tcMar>
+              <w:top w:w="100" w:type="dxa"/>
+              <w:bottom w:w="100" w:type="dxa"/>
+              <w:left w:w="150" w:type="dxa"/>
+              <w:right w:w="150" w:type="dxa"/>
+            </w:tcMar>
+            <w:vAlign w:val="center"/>
+          </w:tcPr>
+          <w:p>
+            <w:pPr>
+              <w:spacing w:before="0" w:after="0"/>
+            </w:pPr>
+            <w:r>
+              <w:rPr>
+                <w:b w:val="0"/>
+                <w:sz w:val="18"/>
+              </w:rPr>
+              <w:t>Guarantees overnight cash certainty</w:t>
+            </w:r>
+          </w:p>
+        </w:tc>
+      </w:tr>
+      <w:tr>
+        <w:tc>
+          <w:tcPr>
+            <w:tcW w:type="dxa" w:w="1987"/>
+            <w:shd w:fill="FFFFFF"/>
+            <w:tcMar>
+              <w:top w:w="100" w:type="dxa"/>
+              <w:bottom w:w="100" w:type="dxa"/>
+              <w:left w:w="150" w:type="dxa"/>
+              <w:right w:w="150" w:type="dxa"/>
+            </w:tcMar>
+            <w:vAlign w:val="center"/>
+          </w:tcPr>
+          <w:p>
+            <w:pPr>
+              <w:spacing w:before="0" w:after="0"/>
+            </w:pPr>
+            <w:r>
+              <w:rPr>
+                <w:b/>
+                <w:sz w:val="18"/>
+              </w:rPr>
+              <w:t>8.1</w:t>
+            </w:r>
+          </w:p>
+        </w:tc>
+        <w:tc>
+          <w:tcPr>
+            <w:tcW w:type="dxa" w:w="1987"/>
+            <w:shd w:fill="FFFFFF"/>
+            <w:tcMar>
+              <w:top w:w="100" w:type="dxa"/>
+              <w:bottom w:w="100" w:type="dxa"/>
+              <w:left w:w="150" w:type="dxa"/>
+              <w:right w:w="150" w:type="dxa"/>
+            </w:tcMar>
+            <w:vAlign w:val="center"/>
+          </w:tcPr>
+          <w:p>
+            <w:pPr>
+              <w:spacing w:before="0" w:after="0"/>
+            </w:pPr>
+            <w:r>
+              <w:rPr>
+                <w:b/>
+                <w:sz w:val="18"/>
+              </w:rPr>
+              <w:t>Parallel High-Frequency Poller</w:t>
+            </w:r>
+          </w:p>
+        </w:tc>
+        <w:tc>
+          <w:tcPr>
+            <w:tcW w:type="dxa" w:w="1987"/>
             <w:shd w:fill="FFFFFF"/>
             <w:tcMar>
               <w:top w:w="100" w:type="dxa"/>
@@ -7634,7 +9639,72 @@
                 <w:b w:val="0"/>
                 <w:sz w:val="18"/>
               </w:rPr>
-              <w:t>Guarantees overnight cash certainty</w:t>
+              <w:t>Open positions &gt; 0</w:t>
+            </w:r>
+          </w:p>
+        </w:tc>
+        <w:tc>
+          <w:tcPr>
+            <w:tcW w:type="dxa" w:w="1987"/>
+            <w:shd w:fill="FFFFFF"/>
+            <w:tcMar>
+              <w:top w:w="100" w:type="dxa"/>
+              <w:bottom w:w="100" w:type="dxa"/>
+              <w:left w:w="150" w:type="dxa"/>
+              <w:right w:w="150" w:type="dxa"/>
+            </w:tcMar>
+            <w:vAlign w:val="center"/>
+          </w:tcPr>
+          <w:p>
+            <w:pPr>
+              <w:spacing w:before="0" w:after="0"/>
+            </w:pPr>
+            <w:r>
+              <w:rPr>
+                <w:b w:val="0"/>
+                <w:sz w:val="18"/>
+              </w:rPr>
+              <w:t xml:space="preserve">1500ms concurrent </w:t>
+            </w:r>
+            <w:r>
+              <w:rPr>
+                <w:rFonts w:ascii="Consolas" w:hAnsi="Consolas"/>
+                <w:color w:val="B42828"/>
+                <w:sz w:val="16"/>
+              </w:rPr>
+              <w:t>Promise.all</w:t>
+            </w:r>
+            <w:r>
+              <w:rPr>
+                <w:b w:val="0"/>
+                <w:sz w:val="18"/>
+              </w:rPr>
+              <w:t xml:space="preserve"> polling</w:t>
+            </w:r>
+          </w:p>
+        </w:tc>
+        <w:tc>
+          <w:tcPr>
+            <w:tcW w:type="dxa" w:w="1987"/>
+            <w:shd w:fill="FFFFFF"/>
+            <w:tcMar>
+              <w:top w:w="100" w:type="dxa"/>
+              <w:bottom w:w="100" w:type="dxa"/>
+              <w:left w:w="150" w:type="dxa"/>
+              <w:right w:w="150" w:type="dxa"/>
+            </w:tcMar>
+            <w:vAlign w:val="center"/>
+          </w:tcPr>
+          <w:p>
+            <w:pPr>
+              <w:spacing w:before="0" w:after="0"/>
+            </w:pPr>
+            <w:r>
+              <w:rPr>
+                <w:b w:val="0"/>
+                <w:sz w:val="18"/>
+              </w:rPr>
+              <w:t>Eliminates network latency cliff bypass</w:t>
             </w:r>
           </w:p>
         </w:tc>

</xml_diff>